<commit_message>
Phase 6 M8: real server-side authentication and role enforcement
scrypt-hashed users, HMAC-signed HttpOnly session cookies, login rate
limiting, proxy plus handler-level role checks, audited username:role
identity on assistant requests, forbidden page, smoke scripts that sign in,
and updated docs and academic deliverables.

Co-Authored-By: Claude Sonnet 5.5 <noreply@anthropic.com>
</commit_message>
<xml_diff>
--- a/docs/academic/MedOrch_Report.docx
+++ b/docs/academic/MedOrch_Report.docx
@@ -3047,7 +3047,7 @@
         <w:jc w:val="left"/>
       </w:pPr>
       <w:r>
-        <w:t xml:space="preserve">Several design choices were made to avoid overstating results: both definitions of readmission are labelled, demonstration-only screens that depend on data the dataset lacks (beds, staff, departments) are hidden by default and badged when shown, executive findings are generated by rules from saved results, and the assistant’s numbers must be traceable to the query result. Any real deployment would additionally need clinical validation, local retraining and recalibration, governance for drift monitoring and rollback, human oversight of any care decision, and real authentication with role-based access; the current login is a client-side demonstration and is not a security boundary.</w:t>
+        <w:t xml:space="preserve">Several design choices were made to avoid overstating results: both definitions of readmission are labelled, demonstration-only screens that depend on data the dataset lacks (beds, staff, departments) are hidden by default and badged when shown, executive findings are generated by rules from saved results, and the assistant’s numbers must be traceable to the query result. Any real deployment would additionally need clinical validation, local retraining and recalibration, governance for drift monitoring and rollback, human oversight of any care decision, and integration with the hospital identity provider (SSO, multi-factor sign-in); the current login is server-side with role-based access and an audited identity, but it is demonstration-grade.</w:t>
       </w:r>
     </w:p>
     <w:p>
@@ -3074,7 +3074,7 @@
         <w:jc w:val="left"/>
       </w:pPr>
       <w:r>
-        <w:t xml:space="preserve">Future work includes external or temporal validation if dated data become available; richer features such as laboratory values and social determinants; subgroup-specific calibration and threshold analysis; drift monitoring and a formal model-governance process; evaluation of the assistant on a larger, independently written question set and with more than one model; and server-side authentication with audited access.</w:t>
+        <w:t xml:space="preserve">Future work includes external or temporal validation if dated data become available; richer features such as laboratory values and social determinants; subgroup-specific calibration and threshold analysis; drift monitoring and a formal model-governance process; evaluation of the assistant on a larger, independently written question set and with more than one model; and SSO, multi-factor sign-in and account management in place of the demonstration accounts.</w:t>
       </w:r>
     </w:p>
     <w:p>

</xml_diff>